<commit_message>
fix (TR): make the first part
</commit_message>
<xml_diff>
--- a/42TR Tehnologiji Rozpodilenyh System/1/TR_KNT-122_Onyshchenko_19_PR1.docx
+++ b/42TR Tehnologiji Rozpodilenyh System/1/TR_KNT-122_Onyshchenko_19_PR1.docx
@@ -8012,14 +8012,10 @@
       <w:r>
         <w:rPr/>
       </w:r>
-      <w:r>
-        <w:br w:type="page"/>
-      </w:r>
     </w:p>
     <w:p>
       <w:pPr>
         <w:pStyle w:val="P1"/>
-        <w:spacing w:before="0" w:after="0"/>
         <w:rPr/>
       </w:pPr>
       <w:r>

</xml_diff>